<commit_message>
Modified daftar hadir kolokium template and route placement, modified .gitignore for templates
</commit_message>
<xml_diff>
--- a/storage/app/templates/kolokium-daftar-hadir.docx
+++ b/storage/app/templates/kolokium-daftar-hadir.docx
@@ -506,36 +506,29 @@
         </w:tabs>
         <w:ind w:left="3119" w:hanging="3119"/>
         <w:rPr>
-          <w:rStyle w:val="Penekanan"/>
+          <w:rStyle w:val="Emphasis"/>
           <w:i w:val="0"/>
         </w:rPr>
       </w:pPr>
       <w:bookmarkStart w:id="0" w:name="_Hlk138611993"/>
       <w:r>
         <w:rPr>
-          <w:rStyle w:val="Penekanan"/>
+          <w:rStyle w:val="Emphasis"/>
           <w:i w:val="0"/>
         </w:rPr>
         <w:t>Nama / NIM / Program Studi</w:t>
       </w:r>
       <w:r>
         <w:rPr>
-          <w:rStyle w:val="Penekanan"/>
+          <w:rStyle w:val="Emphasis"/>
           <w:i w:val="0"/>
         </w:rPr>
         <w:tab/>
-      </w:r>
-      <w:proofErr w:type="gramStart"/>
-      <w:r>
-        <w:rPr>
-          <w:rStyle w:val="Penekanan"/>
-          <w:i w:val="0"/>
-        </w:rPr>
         <w:t xml:space="preserve">: </w:t>
       </w:r>
       <w:r>
         <w:rPr>
-          <w:rStyle w:val="Penekanan"/>
+          <w:rStyle w:val="Emphasis"/>
           <w:i w:val="0"/>
         </w:rPr>
         <w:tab/>
@@ -543,43 +536,42 @@
       </w:r>
       <w:r>
         <w:rPr>
-          <w:rStyle w:val="Penekanan"/>
+          <w:rStyle w:val="Emphasis"/>
           <w:i w:val="0"/>
         </w:rPr>
         <w:t>/</w:t>
       </w:r>
-      <w:proofErr w:type="gramEnd"/>
-      <w:r>
-        <w:rPr>
-          <w:rStyle w:val="Penekanan"/>
+      <w:r>
+        <w:rPr>
+          <w:rStyle w:val="Emphasis"/>
           <w:i w:val="0"/>
         </w:rPr>
         <w:t>${n</w:t>
       </w:r>
       <w:r>
         <w:rPr>
-          <w:rStyle w:val="Penekanan"/>
+          <w:rStyle w:val="Emphasis"/>
           <w:i w:val="0"/>
         </w:rPr>
         <w:t>im</w:t>
       </w:r>
       <w:r>
         <w:rPr>
-          <w:rStyle w:val="Penekanan"/>
+          <w:rStyle w:val="Emphasis"/>
           <w:i w:val="0"/>
         </w:rPr>
         <w:t>}</w:t>
       </w:r>
       <w:r>
         <w:rPr>
-          <w:rStyle w:val="Penekanan"/>
+          <w:rStyle w:val="Emphasis"/>
           <w:i w:val="0"/>
         </w:rPr>
         <w:t>/</w:t>
       </w:r>
       <w:r>
         <w:rPr>
-          <w:rStyle w:val="Penekanan"/>
+          <w:rStyle w:val="Emphasis"/>
           <w:i w:val="0"/>
         </w:rPr>
         <w:t>${</w:t>
@@ -587,7 +579,7 @@
       <w:proofErr w:type="spellStart"/>
       <w:r>
         <w:rPr>
-          <w:rStyle w:val="Penekanan"/>
+          <w:rStyle w:val="Emphasis"/>
           <w:i w:val="0"/>
         </w:rPr>
         <w:t>program_studi</w:t>
@@ -595,7 +587,7 @@
       <w:proofErr w:type="spellEnd"/>
       <w:r>
         <w:rPr>
-          <w:rStyle w:val="Penekanan"/>
+          <w:rStyle w:val="Emphasis"/>
           <w:i w:val="0"/>
         </w:rPr>
         <w:t>}</w:t>
@@ -609,20 +601,20 @@
         </w:tabs>
         <w:ind w:left="3119" w:hanging="3119"/>
         <w:rPr>
-          <w:rStyle w:val="Penekanan"/>
+          <w:rStyle w:val="Emphasis"/>
           <w:i w:val="0"/>
         </w:rPr>
       </w:pPr>
       <w:r>
         <w:rPr>
-          <w:rStyle w:val="Penekanan"/>
+          <w:rStyle w:val="Emphasis"/>
           <w:i w:val="0"/>
         </w:rPr>
         <w:t>Har</w:t>
       </w:r>
       <w:r>
         <w:rPr>
-          <w:rStyle w:val="Penekanan"/>
+          <w:rStyle w:val="Emphasis"/>
           <w:i w:val="0"/>
         </w:rPr>
         <w:t xml:space="preserve">i / </w:t>
@@ -630,7 +622,7 @@
       <w:proofErr w:type="spellStart"/>
       <w:r>
         <w:rPr>
-          <w:rStyle w:val="Penekanan"/>
+          <w:rStyle w:val="Emphasis"/>
           <w:i w:val="0"/>
         </w:rPr>
         <w:t>Tanggal</w:t>
@@ -638,29 +630,22 @@
       <w:proofErr w:type="spellEnd"/>
       <w:r>
         <w:rPr>
-          <w:rStyle w:val="Penekanan"/>
+          <w:rStyle w:val="Emphasis"/>
           <w:i w:val="0"/>
         </w:rPr>
         <w:t xml:space="preserve"> / Jam/ Ruang</w:t>
       </w:r>
       <w:r>
         <w:rPr>
-          <w:rStyle w:val="Penekanan"/>
+          <w:rStyle w:val="Emphasis"/>
           <w:i w:val="0"/>
         </w:rPr>
         <w:tab/>
-      </w:r>
-      <w:proofErr w:type="gramStart"/>
-      <w:r>
-        <w:rPr>
-          <w:rStyle w:val="Penekanan"/>
-          <w:i w:val="0"/>
-        </w:rPr>
         <w:t xml:space="preserve">: </w:t>
       </w:r>
       <w:r>
         <w:rPr>
-          <w:rStyle w:val="Penekanan"/>
+          <w:rStyle w:val="Emphasis"/>
           <w:i w:val="0"/>
         </w:rPr>
         <w:tab/>
@@ -669,7 +654,7 @@
       <w:proofErr w:type="spellStart"/>
       <w:r>
         <w:rPr>
-          <w:rStyle w:val="Penekanan"/>
+          <w:rStyle w:val="Emphasis"/>
           <w:i w:val="0"/>
         </w:rPr>
         <w:t>hari</w:t>
@@ -677,7 +662,7 @@
       <w:proofErr w:type="spellEnd"/>
       <w:r>
         <w:rPr>
-          <w:rStyle w:val="Penekanan"/>
+          <w:rStyle w:val="Emphasis"/>
           <w:i w:val="0"/>
         </w:rPr>
         <w:t>}</w:t>
@@ -688,7 +673,6 @@
         </w:rPr>
         <w:t>/</w:t>
       </w:r>
-      <w:proofErr w:type="gramEnd"/>
       <w:r>
         <w:rPr>
           <w:iCs/>
@@ -772,7 +756,7 @@
       <w:proofErr w:type="spellStart"/>
       <w:r>
         <w:rPr>
-          <w:rStyle w:val="Penekanan"/>
+          <w:rStyle w:val="Emphasis"/>
           <w:i w:val="0"/>
         </w:rPr>
         <w:t>Judul</w:t>
@@ -780,46 +764,38 @@
       <w:proofErr w:type="spellEnd"/>
       <w:r>
         <w:rPr>
-          <w:rStyle w:val="Penekanan"/>
+          <w:rStyle w:val="Emphasis"/>
           <w:i w:val="0"/>
         </w:rPr>
         <w:t xml:space="preserve"> Proposal</w:t>
       </w:r>
       <w:r>
         <w:rPr>
-          <w:rStyle w:val="Penekanan"/>
+          <w:rStyle w:val="Emphasis"/>
           <w:i w:val="0"/>
         </w:rPr>
         <w:tab/>
-      </w:r>
-      <w:proofErr w:type="gramStart"/>
-      <w:r>
-        <w:rPr>
-          <w:rStyle w:val="Penekanan"/>
+        <w:t>:</w:t>
+      </w:r>
+      <w:r>
+        <w:rPr>
+          <w:rStyle w:val="Emphasis"/>
           <w:i w:val="0"/>
         </w:rPr>
-        <w:t>:</w:t>
-      </w:r>
-      <w:r>
-        <w:rPr>
-          <w:rStyle w:val="Penekanan"/>
-          <w:i w:val="0"/>
-        </w:rPr>
         <w:t xml:space="preserve"> </w:t>
       </w:r>
       <w:r>
         <w:rPr>
-          <w:rStyle w:val="Penekanan"/>
+          <w:rStyle w:val="Emphasis"/>
           <w:i w:val="0"/>
         </w:rPr>
         <w:tab/>
         <w:t>${</w:t>
       </w:r>
       <w:proofErr w:type="spellStart"/>
-      <w:proofErr w:type="gramEnd"/>
-      <w:r>
-        <w:rPr>
-          <w:rStyle w:val="Penekanan"/>
+      <w:r>
+        <w:rPr>
+          <w:rStyle w:val="Emphasis"/>
           <w:i w:val="0"/>
         </w:rPr>
         <w:t>judul_proposal</w:t>
@@ -827,7 +803,7 @@
       <w:proofErr w:type="spellEnd"/>
       <w:r>
         <w:rPr>
-          <w:rStyle w:val="Penekanan"/>
+          <w:rStyle w:val="Emphasis"/>
           <w:i w:val="0"/>
         </w:rPr>
         <w:t>}</w:t>
@@ -841,13 +817,13 @@
         <w:ind w:left="3119" w:right="425" w:hanging="3119"/>
         <w:jc w:val="both"/>
         <w:rPr>
-          <w:rStyle w:val="Penekanan"/>
+          <w:rStyle w:val="Emphasis"/>
           <w:i w:val="0"/>
         </w:rPr>
       </w:pPr>
       <w:r>
         <w:rPr>
-          <w:rStyle w:val="Penekanan"/>
+          <w:rStyle w:val="Emphasis"/>
           <w:i w:val="0"/>
         </w:rPr>
         <w:t xml:space="preserve">Dosen </w:t>
@@ -855,7 +831,7 @@
       <w:proofErr w:type="spellStart"/>
       <w:r>
         <w:rPr>
-          <w:rStyle w:val="Penekanan"/>
+          <w:rStyle w:val="Emphasis"/>
           <w:i w:val="0"/>
         </w:rPr>
         <w:t>Pembimbing</w:t>
@@ -863,39 +839,31 @@
       <w:proofErr w:type="spellEnd"/>
       <w:r>
         <w:rPr>
-          <w:rStyle w:val="Penekanan"/>
+          <w:rStyle w:val="Emphasis"/>
           <w:i w:val="0"/>
         </w:rPr>
         <w:t xml:space="preserve"> Utama</w:t>
       </w:r>
       <w:r>
         <w:rPr>
-          <w:rStyle w:val="Penekanan"/>
+          <w:rStyle w:val="Emphasis"/>
           <w:i w:val="0"/>
         </w:rPr>
         <w:tab/>
-      </w:r>
-      <w:proofErr w:type="gramStart"/>
-      <w:r>
-        <w:rPr>
-          <w:rStyle w:val="Penekanan"/>
-          <w:i w:val="0"/>
-        </w:rPr>
         <w:t xml:space="preserve">: </w:t>
       </w:r>
       <w:r>
         <w:rPr>
-          <w:rStyle w:val="Penekanan"/>
+          <w:rStyle w:val="Emphasis"/>
           <w:i w:val="0"/>
         </w:rPr>
         <w:tab/>
         <w:t>${</w:t>
       </w:r>
       <w:proofErr w:type="spellStart"/>
-      <w:proofErr w:type="gramEnd"/>
-      <w:r>
-        <w:rPr>
-          <w:rStyle w:val="Penekanan"/>
+      <w:r>
+        <w:rPr>
+          <w:rStyle w:val="Emphasis"/>
           <w:i w:val="0"/>
         </w:rPr>
         <w:t>nama_pembimbing_utama</w:t>
@@ -903,7 +871,7 @@
       <w:proofErr w:type="spellEnd"/>
       <w:r>
         <w:rPr>
-          <w:rStyle w:val="Penekanan"/>
+          <w:rStyle w:val="Emphasis"/>
           <w:i w:val="0"/>
         </w:rPr>
         <w:t>}</w:t>
@@ -917,13 +885,13 @@
         <w:ind w:left="3119" w:right="425" w:hanging="3119"/>
         <w:jc w:val="both"/>
         <w:rPr>
-          <w:rStyle w:val="Penekanan"/>
+          <w:rStyle w:val="Emphasis"/>
           <w:i w:val="0"/>
         </w:rPr>
       </w:pPr>
       <w:r>
         <w:rPr>
-          <w:rStyle w:val="Penekanan"/>
+          <w:rStyle w:val="Emphasis"/>
           <w:i w:val="0"/>
         </w:rPr>
         <w:t xml:space="preserve">Dosen </w:t>
@@ -931,7 +899,7 @@
       <w:proofErr w:type="spellStart"/>
       <w:r>
         <w:rPr>
-          <w:rStyle w:val="Penekanan"/>
+          <w:rStyle w:val="Emphasis"/>
           <w:i w:val="0"/>
         </w:rPr>
         <w:t>Pembimbing</w:t>
@@ -939,7 +907,7 @@
       <w:proofErr w:type="spellEnd"/>
       <w:r>
         <w:rPr>
-          <w:rStyle w:val="Penekanan"/>
+          <w:rStyle w:val="Emphasis"/>
           <w:i w:val="0"/>
         </w:rPr>
         <w:t xml:space="preserve"> </w:t>
@@ -947,7 +915,7 @@
       <w:proofErr w:type="spellStart"/>
       <w:r>
         <w:rPr>
-          <w:rStyle w:val="Penekanan"/>
+          <w:rStyle w:val="Emphasis"/>
           <w:i w:val="0"/>
         </w:rPr>
         <w:t>Anggota</w:t>
@@ -955,39 +923,31 @@
       <w:proofErr w:type="spellEnd"/>
       <w:r>
         <w:rPr>
-          <w:rStyle w:val="Penekanan"/>
+          <w:rStyle w:val="Emphasis"/>
           <w:i w:val="0"/>
         </w:rPr>
         <w:tab/>
-      </w:r>
-      <w:proofErr w:type="gramStart"/>
-      <w:r>
-        <w:rPr>
-          <w:rStyle w:val="Penekanan"/>
-          <w:i w:val="0"/>
-        </w:rPr>
         <w:t xml:space="preserve">: </w:t>
       </w:r>
       <w:r>
         <w:rPr>
-          <w:rStyle w:val="Penekanan"/>
+          <w:rStyle w:val="Emphasis"/>
           <w:i w:val="0"/>
         </w:rPr>
         <w:tab/>
         <w:t>${</w:t>
       </w:r>
       <w:proofErr w:type="spellStart"/>
-      <w:proofErr w:type="gramEnd"/>
-      <w:r>
-        <w:rPr>
-          <w:rStyle w:val="Penekanan"/>
+      <w:r>
+        <w:rPr>
+          <w:rStyle w:val="Emphasis"/>
           <w:i w:val="0"/>
         </w:rPr>
         <w:t>nama_pembimbing_</w:t>
       </w:r>
       <w:r>
         <w:rPr>
-          <w:rStyle w:val="Penekanan"/>
+          <w:rStyle w:val="Emphasis"/>
           <w:i w:val="0"/>
         </w:rPr>
         <w:t>anggota</w:t>
@@ -995,7 +955,7 @@
       <w:proofErr w:type="spellEnd"/>
       <w:r>
         <w:rPr>
-          <w:rStyle w:val="Penekanan"/>
+          <w:rStyle w:val="Emphasis"/>
           <w:i w:val="0"/>
         </w:rPr>
         <w:t>}</w:t>
@@ -1014,14 +974,14 @@
       </w:pPr>
       <w:r>
         <w:rPr>
-          <w:rStyle w:val="Penekanan"/>
+          <w:rStyle w:val="Emphasis"/>
           <w:i w:val="0"/>
         </w:rPr>
         <w:t>Moderator</w:t>
       </w:r>
       <w:r>
         <w:rPr>
-          <w:rStyle w:val="Penekanan"/>
+          <w:rStyle w:val="Emphasis"/>
           <w:i w:val="0"/>
         </w:rPr>
         <w:tab/>
@@ -1029,7 +989,7 @@
       </w:r>
       <w:r>
         <w:rPr>
-          <w:rStyle w:val="Penekanan"/>
+          <w:rStyle w:val="Emphasis"/>
           <w:i w:val="0"/>
         </w:rPr>
         <w:tab/>
@@ -1037,14 +997,14 @@
       </w:r>
       <w:r>
         <w:rPr>
-          <w:rStyle w:val="Penekanan"/>
+          <w:rStyle w:val="Emphasis"/>
           <w:i w:val="0"/>
         </w:rPr>
         <w:t>moderator</w:t>
       </w:r>
       <w:r>
         <w:rPr>
-          <w:rStyle w:val="Penekanan"/>
+          <w:rStyle w:val="Emphasis"/>
           <w:i w:val="0"/>
         </w:rPr>
         <w:t>}</w:t>
@@ -5052,12 +5012,81 @@
     </w:tbl>
     <w:p>
       <w:pPr>
-        <w:rPr>
-          <w:rFonts w:ascii="Verdana" w:hAnsi="Verdana"/>
-          <w:sz w:val="20"/>
-          <w:szCs w:val="20"/>
-        </w:rPr>
+        <w:jc w:val="center"/>
       </w:pPr>
+      <w:r>
+        <w:t>Moderator</w:t>
+      </w:r>
+    </w:p>
+    <w:p>
+      <w:pPr>
+        <w:jc w:val="center"/>
+      </w:pPr>
+    </w:p>
+    <w:p>
+      <w:pPr>
+        <w:jc w:val="center"/>
+      </w:pPr>
+    </w:p>
+    <w:p>
+      <w:pPr>
+        <w:jc w:val="center"/>
+      </w:pPr>
+    </w:p>
+    <w:p>
+      <w:pPr>
+        <w:jc w:val="center"/>
+      </w:pPr>
+    </w:p>
+    <w:p>
+      <w:pPr>
+        <w:ind w:left="4111"/>
+        <w:rPr>
+          <w:rStyle w:val="Emphasis"/>
+          <w:i w:val="0"/>
+        </w:rPr>
+      </w:pPr>
+      <w:r>
+        <w:rPr>
+          <w:rStyle w:val="Emphasis"/>
+          <w:i w:val="0"/>
+        </w:rPr>
+        <w:t xml:space="preserve"> </w:t>
+      </w:r>
+      <w:r>
+        <w:rPr>
+          <w:rStyle w:val="Emphasis"/>
+          <w:i w:val="0"/>
+        </w:rPr>
+        <w:t>${</w:t>
+      </w:r>
+      <w:r>
+        <w:rPr>
+          <w:rStyle w:val="Emphasis"/>
+          <w:i w:val="0"/>
+        </w:rPr>
+        <w:t>moderator</w:t>
+      </w:r>
+      <w:r>
+        <w:rPr>
+          <w:rStyle w:val="Emphasis"/>
+          <w:i w:val="0"/>
+        </w:rPr>
+        <w:t>}</w:t>
+      </w:r>
+    </w:p>
+    <w:p>
+      <w:pPr>
+        <w:ind w:left="4111"/>
+      </w:pPr>
+      <w:r>
+        <w:rPr>
+          <w:rStyle w:val="Emphasis"/>
+          <w:i w:val="0"/>
+          <w:iCs w:val="0"/>
+        </w:rPr>
+        <w:t xml:space="preserve"> NIP. ${nip}</w:t>
+      </w:r>
     </w:p>
     <w:tbl>
       <w:tblPr>
@@ -5340,6 +5369,50 @@
     <w:lsdException w:name="Subtitle" w:qFormat="1"/>
     <w:lsdException w:name="Strong" w:qFormat="1"/>
     <w:lsdException w:name="Emphasis" w:qFormat="1"/>
+    <w:lsdException w:name="Normal Table" w:semiHidden="1" w:unhideWhenUsed="1"/>
+    <w:lsdException w:name="Table Simple 1" w:semiHidden="1" w:unhideWhenUsed="1"/>
+    <w:lsdException w:name="Table Simple 2" w:semiHidden="1" w:unhideWhenUsed="1"/>
+    <w:lsdException w:name="Table Simple 3" w:semiHidden="1" w:unhideWhenUsed="1"/>
+    <w:lsdException w:name="Table Classic 1" w:semiHidden="1" w:unhideWhenUsed="1"/>
+    <w:lsdException w:name="Table Classic 2" w:semiHidden="1" w:unhideWhenUsed="1"/>
+    <w:lsdException w:name="Table Classic 3" w:semiHidden="1" w:unhideWhenUsed="1"/>
+    <w:lsdException w:name="Table Classic 4" w:semiHidden="1" w:unhideWhenUsed="1"/>
+    <w:lsdException w:name="Table Colorful 1" w:semiHidden="1" w:unhideWhenUsed="1"/>
+    <w:lsdException w:name="Table Colorful 2" w:semiHidden="1" w:unhideWhenUsed="1"/>
+    <w:lsdException w:name="Table Colorful 3" w:semiHidden="1" w:unhideWhenUsed="1"/>
+    <w:lsdException w:name="Table Columns 1" w:semiHidden="1" w:unhideWhenUsed="1"/>
+    <w:lsdException w:name="Table Columns 2" w:semiHidden="1" w:unhideWhenUsed="1"/>
+    <w:lsdException w:name="Table Columns 3" w:semiHidden="1" w:unhideWhenUsed="1"/>
+    <w:lsdException w:name="Table Columns 4" w:semiHidden="1" w:unhideWhenUsed="1"/>
+    <w:lsdException w:name="Table Columns 5" w:semiHidden="1" w:unhideWhenUsed="1"/>
+    <w:lsdException w:name="Table Grid 1" w:semiHidden="1" w:unhideWhenUsed="1"/>
+    <w:lsdException w:name="Table Grid 2" w:semiHidden="1" w:unhideWhenUsed="1"/>
+    <w:lsdException w:name="Table Grid 3" w:semiHidden="1" w:unhideWhenUsed="1"/>
+    <w:lsdException w:name="Table Grid 4" w:semiHidden="1" w:unhideWhenUsed="1"/>
+    <w:lsdException w:name="Table Grid 5" w:semiHidden="1" w:unhideWhenUsed="1"/>
+    <w:lsdException w:name="Table Grid 6" w:semiHidden="1" w:unhideWhenUsed="1"/>
+    <w:lsdException w:name="Table Grid 7" w:semiHidden="1" w:unhideWhenUsed="1"/>
+    <w:lsdException w:name="Table Grid 8" w:semiHidden="1" w:unhideWhenUsed="1"/>
+    <w:lsdException w:name="Table List 1" w:semiHidden="1" w:unhideWhenUsed="1"/>
+    <w:lsdException w:name="Table List 2" w:semiHidden="1" w:unhideWhenUsed="1"/>
+    <w:lsdException w:name="Table List 3" w:semiHidden="1" w:unhideWhenUsed="1"/>
+    <w:lsdException w:name="Table List 4" w:semiHidden="1" w:unhideWhenUsed="1"/>
+    <w:lsdException w:name="Table List 5" w:semiHidden="1" w:unhideWhenUsed="1"/>
+    <w:lsdException w:name="Table List 6" w:semiHidden="1" w:unhideWhenUsed="1"/>
+    <w:lsdException w:name="Table List 7" w:semiHidden="1" w:unhideWhenUsed="1"/>
+    <w:lsdException w:name="Table List 8" w:semiHidden="1" w:unhideWhenUsed="1"/>
+    <w:lsdException w:name="Table 3D effects 1" w:semiHidden="1" w:unhideWhenUsed="1"/>
+    <w:lsdException w:name="Table 3D effects 2" w:semiHidden="1" w:unhideWhenUsed="1"/>
+    <w:lsdException w:name="Table 3D effects 3" w:semiHidden="1" w:unhideWhenUsed="1"/>
+    <w:lsdException w:name="Table Contemporary" w:semiHidden="1" w:unhideWhenUsed="1"/>
+    <w:lsdException w:name="Table Elegant" w:semiHidden="1" w:unhideWhenUsed="1"/>
+    <w:lsdException w:name="Table Professional" w:semiHidden="1" w:unhideWhenUsed="1"/>
+    <w:lsdException w:name="Table Subtle 1" w:semiHidden="1" w:unhideWhenUsed="1"/>
+    <w:lsdException w:name="Table Subtle 2" w:semiHidden="1" w:unhideWhenUsed="1"/>
+    <w:lsdException w:name="Table Web 1" w:semiHidden="1" w:unhideWhenUsed="1"/>
+    <w:lsdException w:name="Table Web 2" w:semiHidden="1" w:unhideWhenUsed="1"/>
+    <w:lsdException w:name="Table Web 3" w:semiHidden="1" w:unhideWhenUsed="1"/>
+    <w:lsdException w:name="Table Theme" w:semiHidden="1" w:unhideWhenUsed="1"/>
     <w:lsdException w:name="Placeholder Text" w:semiHidden="1" w:uiPriority="99"/>
     <w:lsdException w:name="No Spacing" w:uiPriority="1" w:qFormat="1"/>
     <w:lsdException w:name="Light Shading" w:uiPriority="60"/>
@@ -5570,11 +5643,11 @@
       <w:szCs w:val="24"/>
     </w:rPr>
   </w:style>
-  <w:style w:type="paragraph" w:styleId="Judul1">
+  <w:style w:type="paragraph" w:styleId="Heading1">
     <w:name w:val="heading 1"/>
     <w:basedOn w:val="Normal"/>
     <w:next w:val="Normal"/>
-    <w:link w:val="Judul1KAR"/>
+    <w:link w:val="Heading1Char"/>
     <w:qFormat/>
     <w:rsid w:val="00DD4E6C"/>
     <w:pPr>
@@ -5591,13 +5664,17 @@
       <w:szCs w:val="32"/>
     </w:rPr>
   </w:style>
-  <w:style w:type="character" w:default="1" w:styleId="FontParagrafDefault">
+  <w:style w:type="character" w:default="1" w:styleId="DefaultParagraphFont">
     <w:name w:val="Default Paragraph Font"/>
+    <w:uiPriority w:val="1"/>
     <w:semiHidden/>
+    <w:unhideWhenUsed/>
   </w:style>
-  <w:style w:type="table" w:default="1" w:styleId="TabelNormal">
+  <w:style w:type="table" w:default="1" w:styleId="TableNormal">
     <w:name w:val="Normal Table"/>
+    <w:uiPriority w:val="99"/>
     <w:semiHidden/>
+    <w:unhideWhenUsed/>
     <w:tblPr>
       <w:tblInd w:w="0" w:type="dxa"/>
       <w:tblCellMar>
@@ -5608,13 +5685,15 @@
       </w:tblCellMar>
     </w:tblPr>
   </w:style>
-  <w:style w:type="numbering" w:default="1" w:styleId="TidakAdaDaftar">
+  <w:style w:type="numbering" w:default="1" w:styleId="NoList">
     <w:name w:val="No List"/>
+    <w:uiPriority w:val="99"/>
     <w:semiHidden/>
+    <w:unhideWhenUsed/>
   </w:style>
-  <w:style w:type="table" w:styleId="KisiTabel">
+  <w:style w:type="table" w:styleId="TableGrid">
     <w:name w:val="Table Grid"/>
-    <w:basedOn w:val="TabelNormal"/>
+    <w:basedOn w:val="TableNormal"/>
     <w:rsid w:val="00160815"/>
     <w:tblPr>
       <w:tblBorders>
@@ -5627,10 +5706,10 @@
       </w:tblBorders>
     </w:tblPr>
   </w:style>
-  <w:style w:type="paragraph" w:styleId="TeksBalon">
+  <w:style w:type="paragraph" w:styleId="BalloonText">
     <w:name w:val="Balloon Text"/>
     <w:basedOn w:val="Normal"/>
-    <w:link w:val="TeksBalonKAR"/>
+    <w:link w:val="BalloonTextChar"/>
     <w:rsid w:val="001E2FAA"/>
     <w:rPr>
       <w:rFonts w:ascii="Tahoma" w:hAnsi="Tahoma" w:cs="Tahoma"/>
@@ -5638,9 +5717,9 @@
       <w:szCs w:val="16"/>
     </w:rPr>
   </w:style>
-  <w:style w:type="character" w:customStyle="1" w:styleId="TeksBalonKAR">
-    <w:name w:val="Teks Balon KAR"/>
-    <w:link w:val="TeksBalon"/>
+  <w:style w:type="character" w:customStyle="1" w:styleId="BalloonTextChar">
+    <w:name w:val="Balloon Text Char"/>
+    <w:link w:val="BalloonText"/>
     <w:rsid w:val="001E2FAA"/>
     <w:rPr>
       <w:rFonts w:ascii="Tahoma" w:hAnsi="Tahoma" w:cs="Tahoma"/>
@@ -5657,7 +5736,7 @@
       <w:u w:val="single"/>
     </w:rPr>
   </w:style>
-  <w:style w:type="character" w:styleId="Penekanan">
+  <w:style w:type="character" w:styleId="Emphasis">
     <w:name w:val="Emphasis"/>
     <w:qFormat/>
     <w:rsid w:val="00B60737"/>
@@ -5666,9 +5745,9 @@
       <w:iCs/>
     </w:rPr>
   </w:style>
-  <w:style w:type="character" w:customStyle="1" w:styleId="Judul1KAR">
-    <w:name w:val="Judul 1 KAR"/>
-    <w:link w:val="Judul1"/>
+  <w:style w:type="character" w:customStyle="1" w:styleId="Heading1Char">
+    <w:name w:val="Heading 1 Char"/>
+    <w:link w:val="Heading1"/>
     <w:rsid w:val="00DD4E6C"/>
     <w:rPr>
       <w:rFonts w:ascii="Cambria" w:eastAsia="Times New Roman" w:hAnsi="Cambria" w:cs="Times New Roman"/>
@@ -5680,7 +5759,7 @@
       <w:lang w:val="en-US" w:eastAsia="en-US"/>
     </w:rPr>
   </w:style>
-  <w:style w:type="paragraph" w:styleId="TidakAdaSpasi">
+  <w:style w:type="paragraph" w:styleId="NoSpacing">
     <w:name w:val="No Spacing"/>
     <w:uiPriority w:val="1"/>
     <w:qFormat/>

</xml_diff>

<commit_message>
Modified daftar hadir kolokium, added daftar hadir seminar
</commit_message>
<xml_diff>
--- a/storage/app/templates/kolokium-daftar-hadir.docx
+++ b/storage/app/templates/kolokium-daftar-hadir.docx
@@ -691,19 +691,12 @@
         <w:rPr>
           <w:iCs/>
         </w:rPr>
-        <w:t>}</w:t>
+        <w:t>}/</w:t>
       </w:r>
       <w:r>
         <w:rPr>
           <w:iCs/>
         </w:rPr>
-        <w:t>/</w:t>
-      </w:r>
-      <w:r>
-        <w:rPr>
-          <w:iCs/>
-        </w:rPr>
-        <w:tab/>
         <w:t>${</w:t>
       </w:r>
       <w:r>
@@ -4330,17 +4323,8 @@
                 <w:sz w:val="22"/>
                 <w:szCs w:val="22"/>
               </w:rPr>
-              <w:t>25……</w:t>
-            </w:r>
-            <w:proofErr w:type="gramStart"/>
-            <w:r>
-              <w:rPr>
-                <w:sz w:val="22"/>
-                <w:szCs w:val="22"/>
-              </w:rPr>
-              <w:t>…..</w:t>
-            </w:r>
-            <w:proofErr w:type="gramEnd"/>
+              <w:t>25………..</w:t>
+            </w:r>
           </w:p>
         </w:tc>
         <w:tc>
@@ -4584,17 +4568,8 @@
                 <w:sz w:val="22"/>
                 <w:szCs w:val="22"/>
               </w:rPr>
-              <w:t>27……</w:t>
-            </w:r>
-            <w:proofErr w:type="gramStart"/>
-            <w:r>
-              <w:rPr>
-                <w:sz w:val="22"/>
-                <w:szCs w:val="22"/>
-              </w:rPr>
-              <w:t>…..</w:t>
-            </w:r>
-            <w:proofErr w:type="gramEnd"/>
+              <w:t>27………..</w:t>
+            </w:r>
           </w:p>
         </w:tc>
         <w:tc>
@@ -4995,17 +4970,8 @@
                 <w:sz w:val="22"/>
                 <w:szCs w:val="22"/>
               </w:rPr>
-              <w:t>30……</w:t>
-            </w:r>
-            <w:proofErr w:type="gramStart"/>
-            <w:r>
-              <w:rPr>
-                <w:sz w:val="22"/>
-                <w:szCs w:val="22"/>
-              </w:rPr>
-              <w:t>…..</w:t>
-            </w:r>
-            <w:proofErr w:type="gramEnd"/>
+              <w:t>30………..</w:t>
+            </w:r>
           </w:p>
         </w:tc>
       </w:tr>

</xml_diff>